<commit_message>
docs: informe v1.3 final - cierra seccion de trabajo futuro
</commit_message>
<xml_diff>
--- a/docs/informe_v1.3.docx
+++ b/docs/informe_v1.3.docx
@@ -1974,47 +1974,7 @@
         <w:pStyle w:val="Heading1"/>
       </w:pPr>
       <w:r>
-        <w:t>14. Trabajo futuro</w:t>
-      </w:r>
-    </w:p>
-    <w:p>
-      <w:pPr>
-        <w:pStyle w:val="ListBullet"/>
-      </w:pPr>
-      <w:r>
-        <w:t>Firebase Authentication como opción de login en la nube (pendiente declarada desde v1.1).</w:t>
-      </w:r>
-    </w:p>
-    <w:p>
-      <w:pPr>
-        <w:pStyle w:val="ListBullet"/>
-      </w:pPr>
-      <w:r>
-        <w:t>Cifrado de aplicación sobre el canal Bluetooth y/o uso de BLE bonding para mayor confidencialidad.</w:t>
-      </w:r>
-    </w:p>
-    <w:p>
-      <w:pPr>
-        <w:pStyle w:val="ListBullet"/>
-      </w:pPr>
-      <w:r>
-        <w:t>Reemplazar o reparar el módulo "HC-06 ALARMA" (BLE tipo HM-10 con UART defectuoso).</w:t>
-      </w:r>
-    </w:p>
-    <w:p>
-      <w:pPr>
-        <w:pStyle w:val="ListBullet"/>
-      </w:pPr>
-      <w:r>
-        <w:t>Sincronización de datos locales con almacenamiento externo al recuperar la conexión (Paso 5 de la guía).</w:t>
-      </w:r>
-    </w:p>
-    <w:p>
-      <w:pPr>
-        <w:pStyle w:val="Heading1"/>
-      </w:pPr>
-      <w:r>
-        <w:t>15. Referencias</w:t>
+        <w:t>14. Referencias</w:t>
       </w:r>
     </w:p>
     <w:p>

</xml_diff>

<commit_message>
docs: informe v1.3 - aclara modulo HC-05 como hardware del proyecto
</commit_message>
<xml_diff>
--- a/docs/informe_v1.3.docx
+++ b/docs/informe_v1.3.docx
@@ -214,7 +214,7 @@
         <w:rPr>
           <w:b w:val="0"/>
         </w:rPr>
-        <w:t>En la versión 1.3 se consolidó la conectividad Bluetooth con una reescritura completa de la capa de comunicación: soporte dual para Bluetooth clásico SPP (módulo HC-05) y Bluetooth Low Energy GATT tipo HM-10/HC-06, escaneo y emparejado desde la aplicación, reconexión automática tras el vinculado, y un temporizador en el Dashboard que mide en tiempo real el auto-apagado de los actuadores. El firmware del Arduino fue ajustado a un retardo de auto-apagado de 5 segundos y se validó el flujo completo: armar/desarmar, detección de movimiento, activación de sirena y luz, notificación push y apagado automático.</w:t>
+        <w:t>En la versión 1.3 se consolidó la conectividad Bluetooth con una reescritura completa de la capa de comunicación: soporte dual para Bluetooth clásico SPP (módulo HC-05 del proyecto) y Bluetooth Low Energy GATT tipo HM-10 como alternativa, escaneo y emparejado desde la aplicación, reconexión automática tras el vinculado, y un temporizador en el Dashboard que mide en tiempo real el auto-apagado de los actuadores. El firmware del Arduino fue ajustado a un retardo de auto-apagado de 5 segundos y se validó el flujo completo: armar/desarmar, detección de movimiento, activación de sirena y luz, notificación push y apagado automático.</w:t>
       </w:r>
     </w:p>
     <w:p>
@@ -420,7 +420,7 @@
         <w:rPr>
           <w:b w:val="0"/>
         </w:rPr>
-        <w:t>El prototipo utiliza Arduino UNO como microcontrolador principal. El módulo de comunicación inalámbrica es un módulo Bluetooth serie HC-05 (clásico SPP), aunque la aplicación también soporta módulos BLE tipo HM-10/HC-06 (ver sección 8).</w:t>
+        <w:t>El prototipo utiliza Arduino UNO como microcontrolador principal. El módulo de comunicación inalámbrica empleado en el proyecto es un módulo Bluetooth serie HC-05 (clásico SPP). La aplicación, además, incluye soporte para módulos BLE tipo HM-10 como alternativa de hardware.</w:t>
       </w:r>
     </w:p>
     <w:tbl>
@@ -1138,7 +1138,7 @@
         <w:pStyle w:val="ListBullet"/>
       </w:pPr>
       <w:r>
-        <w:t>Escaneo doble: discovery clásico (ACTION_FOUND) y escaneo BLE (ScanSettings LOW_LATENCY), filtrando por nombre de módulo (HC-05, HC-06, HM-, ALARMA, ARDUINO).</w:t>
+        <w:t>Escaneo doble: discovery clásico (ACTION_FOUND) y escaneo BLE (ScanSettings LOW_LATENCY), filtrando por nombre de módulo (por ejemplo HC-05).</w:t>
       </w:r>
     </w:p>
     <w:p>
@@ -1565,38 +1565,6 @@
           <w:p>
             <w:r>
               <w:t>Rediseño del temporizador: cuenta solo la ventana del firmware (desde SENSOR:motion:0) ≈ 5 s</w:t>
-            </w:r>
-          </w:p>
-        </w:tc>
-      </w:tr>
-      <w:tr>
-        <w:tc>
-          <w:tcPr>
-            <w:tcW w:type="dxa" w:w="2880"/>
-          </w:tcPr>
-          <w:p>
-            <w:r>
-              <w:t>Módulo rotulado "HC-06 ALARMA"</w:t>
-            </w:r>
-          </w:p>
-        </w:tc>
-        <w:tc>
-          <w:tcPr>
-            <w:tcW w:type="dxa" w:w="2880"/>
-          </w:tcPr>
-          <w:p>
-            <w:r>
-              <w:t>Corta conexión BLE (status 19) y UART sin datos</w:t>
-            </w:r>
-          </w:p>
-        </w:tc>
-        <w:tc>
-          <w:tcPr>
-            <w:tcW w:type="dxa" w:w="2880"/>
-          </w:tcPr>
-          <w:p>
-            <w:r>
-              <w:t>Resultó ser BLE tipo HM-10 con UART defectuoso; documentado en docs/pendientes.md</w:t>
             </w:r>
           </w:p>
         </w:tc>

</xml_diff>